<commit_message>
data: enrichit l'expérience avant 2024 et ajoute une section début de carrière
- Missions 2010-2024 enrichies depuis le CV long 2024 (résultats chiffrés,
  périmètre, encadrement) ; titres « Architecte logiciel » au singulier
- Nouvelle section early_career (2000-2010) condensée, incluant Code Lutin,
  Sneda, Neobe, stages et junior-entreprise
- Compétences issues des anciens CV (MDA, QueryDSL, jOOQ, SOAP, GeoTools...),
  mention Bien au DEA, IELTS 6,5/9
- Chevauchements de dates corrigés (Sparklane, IHE)
- Rendu early_career dans DOCX, PDF (ATS) et site ; prise en compte dans
  le scoring ATS ; tests associés

Co-Authored-By: Claude Opus 5 (1M context) <noreply@anthropic.com>
</commit_message>
<xml_diff>
--- a/docs/downloads/Gabriel_Landais_CV_FR.docx
+++ b/docs/downloads/Gabriel_Landais_CV_FR.docx
@@ -25,7 +25,7 @@
           <w:b w:val="0"/>
           <w:sz w:val="22"/>
         </w:rPr>
-        <w:t>Architecte logiciels / Freelance</w:t>
+        <w:t>Architecte logiciel / Freelance</w:t>
       </w:r>
     </w:p>
     <w:p>
@@ -96,7 +96,7 @@
           <w:b w:val="0"/>
           <w:sz w:val="22"/>
         </w:rPr>
-        <w:t>Architecture hexagonale, Cloud native, 12-factor app, Reactive, Microservices, KISS, DRY, Domain-Driven Design</w:t>
+        <w:t>Architecture hexagonale, Cloud native, 12-factor app, Reactive, Microservices, KISS, DRY, Domain-Driven Design, Model Driven Architecture (UML, Acceleo), OpenAPI</w:t>
       </w:r>
     </w:p>
     <w:p>
@@ -114,7 +114,7 @@
           <w:b w:val="0"/>
           <w:sz w:val="22"/>
         </w:rPr>
-        <w:t>Java, Quarkus, Spring Boot, Spring, Python, Flask, REST, JPA/Hibernate, Panache, OAuth2 / JWT</w:t>
+        <w:t>Java, Quarkus, Spring Boot, Spring, Python, Flask, REST, JPA/Hibernate, Spring Data, QueryDSL, jOOQ, Panache, OAuth2 / JWT, SOAP (JAX-WS), Diagnostic JVM (profiling, GC, concurrence)</w:t>
       </w:r>
     </w:p>
     <w:p>
@@ -132,7 +132,7 @@
           <w:b w:val="0"/>
           <w:sz w:val="22"/>
         </w:rPr>
-        <w:t>Vue 3, React, TypeScript, JavaScript, HTML5, CSS3</w:t>
+        <w:t>Vue 3, React, Angular, TypeScript, JavaScript, HTML5, CSS3</w:t>
       </w:r>
     </w:p>
     <w:p>
@@ -204,7 +204,7 @@
           <w:b w:val="0"/>
           <w:sz w:val="22"/>
         </w:rPr>
-        <w:t>Docker, Kubernetes, Helm, GCP, AWS, Azure, GKE, Terraform, GitHub Actions, Jenkins, Maven</w:t>
+        <w:t>Docker, Kubernetes, Helm, GCP, AWS, Azure, GKE, Terraform, GitHub Actions, Jenkins, Maven, Nexus, Traefik / Nginx</w:t>
       </w:r>
     </w:p>
     <w:p>
@@ -240,7 +240,7 @@
           <w:b w:val="0"/>
           <w:sz w:val="22"/>
         </w:rPr>
-        <w:t>PostGIS, Leaflet, Mapbox, MapLibre, QGIS, OpenLayers</w:t>
+        <w:t>PostGIS, Leaflet, Mapbox, MapLibre, QGIS, OpenLayers, GeoPackage, GeoTools, GDAL, ArcGIS</w:t>
       </w:r>
     </w:p>
     <w:p>
@@ -278,7 +278,7 @@
           <w:b/>
           <w:sz w:val="22"/>
         </w:rPr>
-        <w:t>Architecte logiciels (Freelance) — Maisons Du Monde</w:t>
+        <w:t>Architecte logiciel (Freelance) — Maisons Du Monde</w:t>
       </w:r>
     </w:p>
     <w:p>
@@ -301,7 +301,7 @@
           <w:b w:val="0"/>
           <w:sz w:val="22"/>
         </w:rPr>
-        <w:t>Conception et mise en œuvre du programme de fidélité omnicanal (web et magasin) dans un délai très court, intégrant données data, web et caisses</w:t>
+        <w:t>Conception et mise en œuvre du programme de fidélité omnicanal (web et magasin) en quelques mois : intégration des données data, web et caisses, calcul des offres selon le statut, APIs synchrones et asynchrones</w:t>
       </w:r>
     </w:p>
     <w:p>
@@ -314,7 +314,7 @@
           <w:b w:val="0"/>
           <w:sz w:val="22"/>
         </w:rPr>
-        <w:t>Responsable du référentiel clients omnicanal : centralisation des données, diffusion par API aux partenaires internes/externes, intégration Captain Wallet pour la carte de fidélité dématérialisée</w:t>
+        <w:t>Architecte de l'équipe Care/Marketing, responsable du référentiel clients omnicanal : centralisation des données, diffusion par API aux partenaires internes/externes, intégration Captain Wallet (carte de fidélité dématérialisée)</w:t>
       </w:r>
     </w:p>
     <w:p>
@@ -327,7 +327,7 @@
           <w:b w:val="0"/>
           <w:sz w:val="22"/>
         </w:rPr>
-        <w:t>Contribution à la plateforme logicielle Java de la DSI : fiabilisation des composants de messaging asynchrone et d'authentification</w:t>
+        <w:t>Cadrage de chaque problématique métier ou défaut de conception, avec des solutions efficientes adaptées à la capacité de l'équipe et aux standards de la DSI</w:t>
       </w:r>
     </w:p>
     <w:p>
@@ -340,7 +340,20 @@
           <w:b w:val="0"/>
           <w:sz w:val="22"/>
         </w:rPr>
-        <w:t>Participation à l'usine logicielle et à la migration Rancher interne → GKE</w:t>
+        <w:t>Deux jours par semaine au sein de l'équipe des architectes Java de la DSI : fiabilisation des composants de messaging asynchrone et d'authentification</w:t>
+      </w:r>
+    </w:p>
+    <w:p>
+      <w:pPr>
+        <w:pStyle w:val="ListBullet"/>
+      </w:pPr>
+      <w:r>
+        <w:rPr>
+          <w:rFonts w:ascii="Calibri" w:hAnsi="Calibri"/>
+          <w:b w:val="0"/>
+          <w:sz w:val="22"/>
+        </w:rPr>
+        <w:t>Usine logicielle : outillage de build pour la migration de Rancher interne vers GKE</w:t>
       </w:r>
     </w:p>
     <w:p>
@@ -358,7 +371,7 @@
           <w:b w:val="0"/>
           <w:sz w:val="20"/>
         </w:rPr>
-        <w:t>Java, Spring Boot, PostgreSQL, Google Cloud, PubSub, Docker, Kubernetes, Rancher, GKE, Helm</w:t>
+        <w:t>Java, Spring Boot, PostgreSQL, Google Cloud, Pub/Sub, Docker, Kubernetes, Rancher, GKE, Helm</w:t>
       </w:r>
     </w:p>
     <w:p>
@@ -368,7 +381,7 @@
           <w:b/>
           <w:sz w:val="22"/>
         </w:rPr>
-        <w:t>Architecte logiciels (Freelance) — Baya</w:t>
+        <w:t>Architecte logiciel (Freelance) — Baya</w:t>
       </w:r>
     </w:p>
     <w:p>
@@ -391,7 +404,7 @@
           <w:b w:val="0"/>
           <w:sz w:val="22"/>
         </w:rPr>
-        <w:t>Modernisation du SI : initialisation d'un back-end Java/Quarkus pour un portail client simplifiant l'onboarding</w:t>
+        <w:t>Modernisation du SI : initialisation du back-end Java/Quarkus d'un portail client simplifiant l'onboarding et l'accès aux services</w:t>
       </w:r>
     </w:p>
     <w:p>
@@ -404,7 +417,7 @@
           <w:b w:val="0"/>
           <w:sz w:val="22"/>
         </w:rPr>
-        <w:t>Utilisation des services managés Azure : authentification, base de données, déploiement container, secrets</w:t>
+        <w:t>Utilisation des services managés Azure : authentification, base de données, déploiement de containers, gestion des secrets, infrastructure Terraform</w:t>
       </w:r>
     </w:p>
     <w:p>
@@ -432,7 +445,7 @@
           <w:b/>
           <w:sz w:val="22"/>
         </w:rPr>
-        <w:t>Architecte logiciels — Sparklane</w:t>
+        <w:t>Architecte logiciel — Sparklane</w:t>
       </w:r>
     </w:p>
     <w:p>
@@ -442,7 +455,7 @@
           <w:b w:val="0"/>
           <w:sz w:val="20"/>
         </w:rPr>
-        <w:t>2020-01 – 2021-01 | Nantes</w:t>
+        <w:t>2020-03 – 2021-01 | Nantes</w:t>
       </w:r>
     </w:p>
     <w:p>
@@ -455,7 +468,7 @@
           <w:b w:val="0"/>
           <w:sz w:val="22"/>
         </w:rPr>
-        <w:t>Migration d'une livraison de données mensuelle vers un pipeline de streaming en faisant collaborer trois équipes autonomes</w:t>
+        <w:t>Pilotage de la bascule d'une livraison de données mensuelle vers un pipeline de streaming, en faisant coopérer trois équipes autonomes (R&amp;D, data, produit) d'un produit SaaS B2B</w:t>
       </w:r>
     </w:p>
     <w:p>
@@ -468,7 +481,7 @@
           <w:b w:val="0"/>
           <w:sz w:val="22"/>
         </w:rPr>
-        <w:t>Industrialisation des développements data : pipelines Jenkins, images Docker déployées avec Terraform sur Rancher 2</w:t>
+        <w:t>Industrialisation des développements data de la source à la production : découpage en dépôts isolant la valeur métier, pipelines Jenkins, images Docker déployées avec Terraform sur Rancher 2</w:t>
       </w:r>
     </w:p>
     <w:p>
@@ -481,7 +494,7 @@
           <w:b w:val="0"/>
           <w:sz w:val="22"/>
         </w:rPr>
-        <w:t>Développement d'une solution de géocodage d'adresses et de détection de signaux d'affaires en flux (changement de poste, brevets)</w:t>
+        <w:t>Développement d'outillage mutualisé facilitant l'adoption de l'architecture préconisée</w:t>
       </w:r>
     </w:p>
     <w:p>
@@ -494,7 +507,20 @@
           <w:b w:val="0"/>
           <w:sz w:val="22"/>
         </w:rPr>
-        <w:t>Accompagnement des développeurs dans la migration vers le streaming via des articles techniques détaillés</w:t>
+        <w:t>Premiers composants d'enrichissement en flux : géocodage d'adresses (après étude des données ouvertes) et signaux d'affaires (changement de poste, brevets) notifiés aux commerciaux</w:t>
+      </w:r>
+    </w:p>
+    <w:p>
+      <w:pPr>
+        <w:pStyle w:val="ListBullet"/>
+      </w:pPr>
+      <w:r>
+        <w:rPr>
+          <w:rFonts w:ascii="Calibri" w:hAnsi="Calibri"/>
+          <w:b w:val="0"/>
+          <w:sz w:val="22"/>
+        </w:rPr>
+        <w:t>Accompagnement des développeurs vers le streaming par des articles techniques détaillés</w:t>
       </w:r>
     </w:p>
     <w:p>
@@ -512,7 +538,7 @@
           <w:b w:val="0"/>
           <w:sz w:val="20"/>
         </w:rPr>
-        <w:t>Java, Quarkus, MongoDB, Kafka, Docker, Kubernetes, Rancher 2, Terraform, Prometheus, Grafana, ELK</w:t>
+        <w:t>Java, Quarkus, MongoDB, Kafka, Docker, Kubernetes, Rancher 2, Terraform, Jenkins, Prometheus, Grafana, ELK</w:t>
       </w:r>
     </w:p>
     <w:p>
@@ -545,7 +571,7 @@
           <w:b w:val="0"/>
           <w:sz w:val="22"/>
         </w:rPr>
-        <w:t>Reprise en main et rationalisation du produit Vecko (analyse de la voix du client) pour cible cloud/SaaS multi-tenant</w:t>
+        <w:t>Reprise en main du produit Vecko (analyse de la voix du client) après une longue période sans responsable technique, et rationalisation pour une cible SaaS multi-tenant (images Docker stateless)</w:t>
       </w:r>
     </w:p>
     <w:p>
@@ -558,7 +584,7 @@
           <w:b w:val="0"/>
           <w:sz w:val="22"/>
         </w:rPr>
-        <w:t>Adoption du paradigme reactive (Spring Boot 2, Cassandra, Kafka, Elasticsearch) pour le traitement de flux multi-clients</w:t>
+        <w:t>Adoption du paradigme reactive (Spring Boot 2, Cassandra, Kafka, clients HTTP asynchrones) pour traiter des flux avec une configuration propre à chaque client</w:t>
       </w:r>
     </w:p>
     <w:p>
@@ -571,7 +597,7 @@
           <w:b w:val="0"/>
           <w:sz w:val="22"/>
         </w:rPr>
-        <w:t>Mise en place de l'architecture micro-UI et déploiement sur GKE avec nombreux clients en production</w:t>
+        <w:t>Observabilité : métriques métier (Micrometer), tracing distribué (Brave), dashboards et alerting Prometheus/Grafana, charts Helm</w:t>
       </w:r>
     </w:p>
     <w:p>
@@ -584,7 +610,33 @@
           <w:b w:val="0"/>
           <w:sz w:val="22"/>
         </w:rPr>
-        <w:t>Responsable de l'architecture, de la production, de l'intégration des données clients, de la qualité et du reporting CTO</w:t>
+        <w:t>Architecture micro-UI (React) remplaçant l'adaptation de Kibana, pour une UI homogène laissant la liberté des choix techniques</w:t>
+      </w:r>
+    </w:p>
+    <w:p>
+      <w:pPr>
+        <w:pStyle w:val="ListBullet"/>
+      </w:pPr>
+      <w:r>
+        <w:rPr>
+          <w:rFonts w:ascii="Calibri" w:hAnsi="Calibri"/>
+          <w:b w:val="0"/>
+          <w:sz w:val="22"/>
+        </w:rPr>
+        <w:t>Mise en production sur GKE avec rapidement de nombreux clients ; responsable de l'architecture, du run, de l'intégration des données clients (API, fichiers) et de la qualité</w:t>
+      </w:r>
+    </w:p>
+    <w:p>
+      <w:pPr>
+        <w:pStyle w:val="ListBullet"/>
+      </w:pPr>
+      <w:r>
+        <w:rPr>
+          <w:rFonts w:ascii="Calibri" w:hAnsi="Calibri"/>
+          <w:b w:val="0"/>
+          <w:sz w:val="22"/>
+        </w:rPr>
+        <w:t>Traduction des epics fonctionnelles en backlog technique priorisé (sprints de 2 semaines), outils de configuration pour les linguistes et le product manager, reporting bimensuel au CTO</w:t>
       </w:r>
     </w:p>
     <w:p>
@@ -602,7 +654,7 @@
           <w:b w:val="0"/>
           <w:sz w:val="20"/>
         </w:rPr>
-        <w:t>Java, Spring Boot, Cassandra, Kafka, Elasticsearch, Kibana, React, Docker, Kubernetes, Helm, Prometheus, Grafana</w:t>
+        <w:t>Java, Spring Boot, Cassandra, Kafka, Elasticsearch, Kibana, React, Docker, Kubernetes, GKE, Helm, Prometheus, Grafana, Micrometer</w:t>
       </w:r>
     </w:p>
     <w:p>
@@ -612,7 +664,7 @@
           <w:b/>
           <w:sz w:val="22"/>
         </w:rPr>
-        <w:t>Architecte solution — Capgemini</w:t>
+        <w:t>Responsable technique / Architecte solution — Capgemini</w:t>
       </w:r>
     </w:p>
     <w:p>
@@ -635,7 +687,7 @@
           <w:b w:val="0"/>
           <w:sz w:val="22"/>
         </w:rPr>
-        <w:t>Projet LivingPackets : architecture microservices sur Google Cloud (AppEngine, Datastore), génération de clients mobiles depuis OpenAPI, encadrement de 5 développeurs</w:t>
+        <w:t>LivingPackets : architecture microservices sur Google Cloud (App Engine, Datastore, Dataflow, Pub/Sub), contrats OpenAPI générant les clients mobiles, accompagnement de 5 développeurs, back-office Angular</w:t>
       </w:r>
     </w:p>
     <w:p>
@@ -648,7 +700,7 @@
           <w:b w:val="0"/>
           <w:sz w:val="22"/>
         </w:rPr>
-        <w:t>Projet ETCS (SNCF Réseau) : développement from scratch d'un plugin QGIS Python/PyQt pour la saisie de schémas de voie ferroviaire</w:t>
+        <w:t>ETCS (SNCF Réseau) : cadre de développement d'un plugin QGIS Python/PyQt posé en 2 semaines, puis réécriture iso-fonctionnelle d'une application complexe en 2 mois avec 2 développeurs</w:t>
       </w:r>
     </w:p>
     <w:p>
@@ -661,7 +713,7 @@
           <w:b w:val="0"/>
           <w:sz w:val="22"/>
         </w:rPr>
-        <w:t>Projet Geocatalogue (BRGM) : migration vers Solr, excédent de 30k€ sur budget, ~100 jours/homme</w:t>
+        <w:t>Geocatalogue (BRGM) : migration d'Exalead vers Solr, conception et encadrement de 2 développeurs ; forfait livré avec une marge de 30 k€ au-dessus du budget (~100 j/h)</w:t>
       </w:r>
     </w:p>
     <w:p>
@@ -674,7 +726,20 @@
           <w:b w:val="0"/>
           <w:sz w:val="22"/>
         </w:rPr>
-        <w:t>Projet Verdi (SIG) : responsable technique d'une équipe de 12 développeurs, remplacement de technologies ESRI propriétaires par du code spécifique</w:t>
+        <w:t>Verdi (SIG grande envergure) : responsable technique jusqu'à 12 développeurs (socle technique, revues de code, qualité Sonar) ; remplacement de briques ESRI propriétaires par du code spécifique, rendant le projet éligible au CIR</w:t>
+      </w:r>
+    </w:p>
+    <w:p>
+      <w:pPr>
+        <w:pStyle w:val="ListBullet"/>
+      </w:pPr>
+      <w:r>
+        <w:rPr>
+          <w:rFonts w:ascii="Calibri" w:hAnsi="Calibri"/>
+          <w:b w:val="0"/>
+          <w:sz w:val="22"/>
+        </w:rPr>
+        <w:t>Verdi : ORM géographique sur QueryDSL, mode hors ligne GeoPackage avec synchronisation vers Oracle, client Swing MVP/Spring</w:t>
       </w:r>
     </w:p>
     <w:p>
@@ -692,7 +757,7 @@
           <w:b w:val="0"/>
           <w:sz w:val="20"/>
         </w:rPr>
-        <w:t>Java, Spring, Python, PyQT, SIG, ESRI, Oracle, GCP, Solr, QueryDSL, PostgreSQL, PostGIS</w:t>
+        <w:t>Java, Spring, QueryDSL, Oracle, PostgreSQL, PostGIS, GeoPackage, Python, PyQt, QGIS, ESRI, Solr, Google Cloud, Angular</w:t>
       </w:r>
     </w:p>
     <w:p>
@@ -725,7 +790,7 @@
           <w:b w:val="0"/>
           <w:sz w:val="22"/>
         </w:rPr>
-        <w:t>Intégration d'un webmail dans la messagerie interne du produit ENT, déployé pour l'ensemble d'une académie</w:t>
+        <w:t>Intégration en délai court d'un webmail dans la messagerie de l'ENT (unité de 11 personnes), déployée pour tous les élèves et personnels d'une académie : conception, développement, recette</w:t>
       </w:r>
     </w:p>
     <w:p>
@@ -738,7 +803,7 @@
           <w:b w:val="0"/>
           <w:sz w:val="22"/>
         </w:rPr>
-        <w:t>POC moteur de recherche full-text (Solr vs Elasticsearch) sur le CMS maison, avec API intégrable dans l'existant</w:t>
+        <w:t>Étude comparative Solr / Elasticsearch et POC d'API de recherche full-text intégrable au CMS maison, validé sur un projet client</w:t>
       </w:r>
     </w:p>
     <w:p>
@@ -776,7 +841,7 @@
           <w:b w:val="0"/>
           <w:sz w:val="20"/>
         </w:rPr>
-        <w:t>2010-01 – 2013-01 | Rennes</w:t>
+        <w:t>2010-04 – 2013-01 | Rennes</w:t>
       </w:r>
     </w:p>
     <w:p>
@@ -789,7 +854,7 @@
           <w:b w:val="0"/>
           <w:sz w:val="22"/>
         </w:rPr>
-        <w:t>Maintenance et optimisation du projet Gazelle (gestion de Connectathons d'interopérabilité santé) : modularisation Maven, optimisation mémoire, cache second niveau</w:t>
+        <w:t>Gazelle, outil de gestion des Connectathons d'interopérabilité santé (plusieurs centaines d'éditeurs) : modularisation Maven, optimisation des performances (requêtage, mémoire, cache second niveau), réécriture des parties les plus instables</w:t>
       </w:r>
     </w:p>
     <w:p>
@@ -802,7 +867,7 @@
           <w:b w:val="0"/>
           <w:sz w:val="22"/>
         </w:rPr>
-        <w:t>Développement d'un proxy réseau d'interception de messages (Netty)</w:t>
+        <w:t>Développement d'un proxy d'interception de messages (Netty) et d'un outil de génération et validation de certificats PKI/TLS (BouncyCastle, approche TDD)</w:t>
       </w:r>
     </w:p>
     <w:p>
@@ -815,20 +880,7 @@
           <w:b w:val="0"/>
           <w:sz w:val="22"/>
         </w:rPr>
-        <w:t>Développement d'un outil de génération et validation de certificats PKI/TLS (BouncyCastle, TDD)</w:t>
-      </w:r>
-    </w:p>
-    <w:p>
-      <w:pPr>
-        <w:pStyle w:val="ListBullet"/>
-      </w:pPr>
-      <w:r>
-        <w:rPr>
-          <w:rFonts w:ascii="Calibri" w:hAnsi="Calibri"/>
-          <w:b w:val="0"/>
-          <w:sz w:val="22"/>
-        </w:rPr>
-        <w:t>Administration système et support international (USA, Japon)</w:t>
+        <w:t>Architecture logicielle, formation et revues de code dans une équipe de 6 personnes ; administration système et support international (USA, Japon)</w:t>
       </w:r>
     </w:p>
     <w:p>
@@ -846,7 +898,17 @@
           <w:b w:val="0"/>
           <w:sz w:val="20"/>
         </w:rPr>
-        <w:t>Java, Seam, JBoss, Maven, Jenkins, Hibernate, Netty, BouncyCastle, PostgreSQL</w:t>
+        <w:t>Java, JBoss Seam, JSF, Hibernate, Maven, Jenkins, Netty, BouncyCastle, PostgreSQL</w:t>
+      </w:r>
+    </w:p>
+    <w:p>
+      <w:r>
+        <w:rPr>
+          <w:rFonts w:ascii="Calibri" w:hAnsi="Calibri"/>
+          <w:b/>
+          <w:sz w:val="24"/>
+        </w:rPr>
+        <w:t>Début de carrière</w:t>
       </w:r>
     </w:p>
     <w:p>
@@ -856,40 +918,15 @@
           <w:b/>
           <w:sz w:val="22"/>
         </w:rPr>
-        <w:t>Ingénieur d'études — Mediasofts</w:t>
+        <w:t xml:space="preserve">2009 – 2010 — Mediasofts, Ingénieur d'études : </w:t>
       </w:r>
-    </w:p>
-    <w:p>
-      <w:r>
-        <w:rPr>
-          <w:rFonts w:ascii="Calibri" w:hAnsi="Calibri"/>
-          <w:b w:val="0"/>
-          <w:sz w:val="20"/>
-        </w:rPr>
-        <w:t>2009-01 – 2010-01 | Nantes</w:t>
-      </w:r>
-    </w:p>
-    <w:p>
-      <w:pPr>
-        <w:pStyle w:val="ListBullet"/>
-      </w:pPr>
       <w:r>
         <w:rPr>
           <w:rFonts w:ascii="Calibri" w:hAnsi="Calibri"/>
           <w:b w:val="0"/>
           <w:sz w:val="22"/>
         </w:rPr>
-        <w:t>Réécriture du module escalier dans Metalcad : modélisation 3D, rendu OpenGL, calcul de surfaces (intersection, projection, extrusion), génération de plans AutoCAD</w:t>
-      </w:r>
-    </w:p>
-    <w:p>
-      <w:r>
-        <w:rPr>
-          <w:rFonts w:ascii="Calibri" w:hAnsi="Calibri"/>
-          <w:b/>
-          <w:sz w:val="20"/>
-        </w:rPr>
-        <w:t xml:space="preserve">Stack : </w:t>
+        <w:t>Réécriture du module escalier du logiciel de CAO Metalcad : modélisation et calculs 3D, rendu OpenGL, génération de plans AutoCAD</w:t>
       </w:r>
       <w:r>
         <w:rPr>
@@ -897,7 +934,7 @@
           <w:b w:val="0"/>
           <w:sz w:val="20"/>
         </w:rPr>
-        <w:t>Delphi, OpenGL, AutoCAD</w:t>
+        <w:t xml:space="preserve"> (Delphi, OpenGL)</w:t>
       </w:r>
     </w:p>
     <w:p>
@@ -907,53 +944,15 @@
           <w:b/>
           <w:sz w:val="22"/>
         </w:rPr>
-        <w:t>Recherche et développement — BlueXML</w:t>
+        <w:t xml:space="preserve">2009 — Sneda, Recherche et développement : </w:t>
       </w:r>
-    </w:p>
-    <w:p>
-      <w:r>
-        <w:rPr>
-          <w:rFonts w:ascii="Calibri" w:hAnsi="Calibri"/>
-          <w:b w:val="0"/>
-          <w:sz w:val="20"/>
-        </w:rPr>
-        <w:t>2007-01 – 2009-01 | Nantes</w:t>
-      </w:r>
-    </w:p>
-    <w:p>
-      <w:pPr>
-        <w:pStyle w:val="ListBullet"/>
-      </w:pPr>
       <w:r>
         <w:rPr>
           <w:rFonts w:ascii="Calibri" w:hAnsi="Calibri"/>
           <w:b w:val="0"/>
           <w:sz w:val="22"/>
         </w:rPr>
-        <w:t>Développement d'un outil de modélisation et génération de code pour Alfresco</w:t>
-      </w:r>
-    </w:p>
-    <w:p>
-      <w:pPr>
-        <w:pStyle w:val="ListBullet"/>
-      </w:pPr>
-      <w:r>
-        <w:rPr>
-          <w:rFonts w:ascii="Calibri" w:hAnsi="Calibri"/>
-          <w:b w:val="0"/>
-          <w:sz w:val="22"/>
-        </w:rPr>
-        <w:t>Génération de formulaires XForms depuis modèle (plugin Maven)</w:t>
-      </w:r>
-    </w:p>
-    <w:p>
-      <w:r>
-        <w:rPr>
-          <w:rFonts w:ascii="Calibri" w:hAnsi="Calibri"/>
-          <w:b/>
-          <w:sz w:val="20"/>
-        </w:rPr>
-        <w:t xml:space="preserve">Stack : </w:t>
+        <w:t>Profiler Java, driver ODA pour BIRT, intégration continue d'applications Eclipse RCP/OSGi</w:t>
       </w:r>
       <w:r>
         <w:rPr>
@@ -961,7 +960,7 @@
           <w:b w:val="0"/>
           <w:sz w:val="20"/>
         </w:rPr>
-        <w:t>Java, Maven, Eclipse, Alfresco, XForms, Acceleo</w:t>
+        <w:t xml:space="preserve"> (Java, Eclipse RCP, OSGi, Maven, Tycho, Nexus)</w:t>
       </w:r>
     </w:p>
     <w:p>
@@ -971,66 +970,15 @@
           <w:b/>
           <w:sz w:val="22"/>
         </w:rPr>
-        <w:t>Ingénieur développement — Capgemini</w:t>
+        <w:t xml:space="preserve">2008 – 2009 — BlueXML, Recherche et développement : </w:t>
       </w:r>
-    </w:p>
-    <w:p>
-      <w:r>
-        <w:rPr>
-          <w:rFonts w:ascii="Calibri" w:hAnsi="Calibri"/>
-          <w:b w:val="0"/>
-          <w:sz w:val="20"/>
-        </w:rPr>
-        <w:t>2006-01 – 2007-01 | Nantes</w:t>
-      </w:r>
-    </w:p>
-    <w:p>
-      <w:pPr>
-        <w:pStyle w:val="ListBullet"/>
-      </w:pPr>
       <w:r>
         <w:rPr>
           <w:rFonts w:ascii="Calibri" w:hAnsi="Calibri"/>
           <w:b w:val="0"/>
           <w:sz w:val="22"/>
         </w:rPr>
-        <w:t>Projet Paris à la Carte : refonte du site cartographique (OpenLayers, ArcIMS, DWR, JSP)</w:t>
-      </w:r>
-    </w:p>
-    <w:p>
-      <w:pPr>
-        <w:pStyle w:val="ListBullet"/>
-      </w:pPr>
-      <w:r>
-        <w:rPr>
-          <w:rFonts w:ascii="Calibri" w:hAnsi="Calibri"/>
-          <w:b w:val="0"/>
-          <w:sz w:val="22"/>
-        </w:rPr>
-        <w:t>Projet GTSM (gestion de stock militaire) : génération MDA Acceleo, JSP/Struts, Hibernate</w:t>
-      </w:r>
-    </w:p>
-    <w:p>
-      <w:pPr>
-        <w:pStyle w:val="ListBullet"/>
-      </w:pPr>
-      <w:r>
-        <w:rPr>
-          <w:rFonts w:ascii="Calibri" w:hAnsi="Calibri"/>
-          <w:b w:val="0"/>
-          <w:sz w:val="22"/>
-        </w:rPr>
-        <w:t>Projet Caisse d'Épargne : front office assurance vie, génération MDA MIA, ASP.NET</w:t>
-      </w:r>
-    </w:p>
-    <w:p>
-      <w:r>
-        <w:rPr>
-          <w:rFonts w:ascii="Calibri" w:hAnsi="Calibri"/>
-          <w:b/>
-          <w:sz w:val="20"/>
-        </w:rPr>
-        <w:t xml:space="preserve">Stack : </w:t>
+        <w:t>Modeleur Eclipse (Topcased/EMF) et génération de code pour Alfresco ; génération de formulaires XForms depuis un métamodèle (plugin Maven)</w:t>
       </w:r>
       <w:r>
         <w:rPr>
@@ -1038,7 +986,7 @@
           <w:b w:val="0"/>
           <w:sz w:val="20"/>
         </w:rPr>
-        <w:t>Java, Hibernate, Struts, JSP, ASP.NET, SIG, OpenLayers</w:t>
+        <w:t xml:space="preserve"> (Java, EMF, Acceleo, Alfresco, XForms, Maven)</w:t>
       </w:r>
     </w:p>
     <w:p>
@@ -1048,30 +996,23 @@
           <w:b/>
           <w:sz w:val="22"/>
         </w:rPr>
-        <w:t>Concepteur développeur — Mediasofts</w:t>
+        <w:t xml:space="preserve">2007 – 2008 — Code Lutin, Ingénieur développement : </w:t>
       </w:r>
-    </w:p>
-    <w:p>
+      <w:r>
+        <w:rPr>
+          <w:rFonts w:ascii="Calibri" w:hAnsi="Calibri"/>
+          <w:b w:val="0"/>
+          <w:sz w:val="22"/>
+        </w:rPr>
+        <w:t>Applications web JEE5</w:t>
+      </w:r>
       <w:r>
         <w:rPr>
           <w:rFonts w:ascii="Calibri" w:hAnsi="Calibri"/>
           <w:b w:val="0"/>
           <w:sz w:val="20"/>
         </w:rPr>
-        <w:t>2004-01 – 2006-01 | Nantes</w:t>
-      </w:r>
-    </w:p>
-    <w:p>
-      <w:pPr>
-        <w:pStyle w:val="ListBullet"/>
-      </w:pPr>
-      <w:r>
-        <w:rPr>
-          <w:rFonts w:ascii="Calibri" w:hAnsi="Calibri"/>
-          <w:b w:val="0"/>
-          <w:sz w:val="22"/>
-        </w:rPr>
-        <w:t>Module escalier Metalcad, répartition automatique de végétaux, optimisation de découpes</w:t>
+        <w:t xml:space="preserve"> (Java, JBoss, EJB3, JPA, JAAS, Tapestry, Axis, Lucene)</w:t>
       </w:r>
     </w:p>
     <w:p>
@@ -1079,9 +1020,17 @@
         <w:rPr>
           <w:rFonts w:ascii="Calibri" w:hAnsi="Calibri"/>
           <w:b/>
-          <w:sz w:val="20"/>
+          <w:sz w:val="22"/>
         </w:rPr>
-        <w:t xml:space="preserve">Stack : </w:t>
+        <w:t xml:space="preserve">2006 – 2007 — Capgemini, Ingénieur développement : </w:t>
+      </w:r>
+      <w:r>
+        <w:rPr>
+          <w:rFonts w:ascii="Calibri" w:hAnsi="Calibri"/>
+          <w:b w:val="0"/>
+          <w:sz w:val="22"/>
+        </w:rPr>
+        <w:t>Génération MDA depuis UML (gestion de stock de munitions pour l'armée de Terre, souscription d'assurance vie pour la Caisse d'Épargne) ; SIG pour la Ville de Paris (refonte de Paris à la Carte, support ArcGIS)</w:t>
       </w:r>
       <w:r>
         <w:rPr>
@@ -1089,7 +1038,59 @@
           <w:b w:val="0"/>
           <w:sz w:val="20"/>
         </w:rPr>
-        <w:t>Delphi, OpenGL, AutoCAD, calcul 3D</w:t>
+        <w:t xml:space="preserve"> (Java, Struts, Hibernate, Acceleo, ASP.NET, OpenLayers, ArcGIS)</w:t>
+      </w:r>
+    </w:p>
+    <w:p>
+      <w:r>
+        <w:rPr>
+          <w:rFonts w:ascii="Calibri" w:hAnsi="Calibri"/>
+          <w:b/>
+          <w:sz w:val="22"/>
+        </w:rPr>
+        <w:t xml:space="preserve">2004 – 2006 — Mediasofts, Concepteur développeur : </w:t>
+      </w:r>
+      <w:r>
+        <w:rPr>
+          <w:rFonts w:ascii="Calibri" w:hAnsi="Calibri"/>
+          <w:b w:val="0"/>
+          <w:sz w:val="22"/>
+        </w:rPr>
+        <w:t>Conception du module escalier de Metalcad, répartition automatique de végétaux, optimisation de découpes</w:t>
+      </w:r>
+      <w:r>
+        <w:rPr>
+          <w:rFonts w:ascii="Calibri" w:hAnsi="Calibri"/>
+          <w:b w:val="0"/>
+          <w:sz w:val="20"/>
+        </w:rPr>
+        <w:t xml:space="preserve"> (Delphi, OpenGL)</w:t>
+      </w:r>
+    </w:p>
+    <w:p>
+      <w:r>
+        <w:rPr>
+          <w:rFonts w:ascii="Calibri" w:hAnsi="Calibri"/>
+          <w:b/>
+          <w:sz w:val="22"/>
+        </w:rPr>
+        <w:t xml:space="preserve">2000 – 2004 — Stages et premiers projets : </w:t>
+      </w:r>
+      <w:r>
+        <w:rPr>
+          <w:rFonts w:ascii="Calibri" w:hAnsi="Calibri"/>
+          <w:b w:val="0"/>
+          <w:sz w:val="22"/>
+        </w:rPr>
+        <w:t>Logiciel de télésauvegarde neobe Backup (Neobe) ; saisie GPS nomade (Cadden) ; atelier statistique de benchmarking (Ordimega) ; migration vers MX4J/JMX open source (Corizon, Londres) ; plus de 10 projets en junior-entreprise dont plusieurs comme chef de projet</w:t>
+      </w:r>
+      <w:r>
+        <w:rPr>
+          <w:rFonts w:ascii="Calibri" w:hAnsi="Calibri"/>
+          <w:b w:val="0"/>
+          <w:sz w:val="20"/>
+        </w:rPr>
+        <w:t xml:space="preserve"> (Delphi, Java, C++, PHP)</w:t>
       </w:r>
     </w:p>
     <w:p>
@@ -1109,7 +1110,7 @@
           <w:b/>
           <w:sz w:val="22"/>
         </w:rPr>
-        <w:t>DEA / Master 2 recherche Sciences de l'information géographique — ENSG-Géomatique (Université de Marne-la-Vallée)</w:t>
+        <w:t>DEA / Master 2 recherche Sciences de l'information géographique (mention Bien) — ENSG-Géomatique (Université de Marne-la-Vallée)</w:t>
       </w:r>
     </w:p>
     <w:p>
@@ -1239,7 +1240,7 @@
           <w:b w:val="0"/>
           <w:sz w:val="22"/>
         </w:rPr>
-        <w:t>Anglais — Professionnel (support international USA/Japon chez IHE Services)</w:t>
+        <w:t>Anglais — Professionnel — IELTS 6,5/9, support international (USA, Japon)</w:t>
       </w:r>
     </w:p>
     <w:p>

</xml_diff>

<commit_message>
data: ajoute la mission Cetelem (RCU) et enrichit MDM et les compétences
- Mission BNP Paribas Personal Finance (Cetelem) 2024-10 → 2025-03 :
  cadrage du Référentiel Client Unique, formulée de façon générique
- Maisons Du Monde : RCU omnicanal, partenaires alimentés, étude CDP
- Compétences : Sécurité, IA générative, CQRS, event-driven, SOLID,
  référentiels clients, SAFe, Jira/Confluence ; retrait de KISS/DRY

Co-Authored-By: Claude Opus 5 (1M context) <noreply@anthropic.com>
</commit_message>
<xml_diff>
--- a/docs/downloads/Gabriel_Landais_CV_FR.docx
+++ b/docs/downloads/Gabriel_Landais_CV_FR.docx
@@ -96,7 +96,7 @@
           <w:b w:val="0"/>
           <w:sz w:val="22"/>
         </w:rPr>
-        <w:t>Architecture hexagonale, Cloud native, 12-factor app, Reactive, Microservices, KISS, DRY, Domain-Driven Design, Model Driven Architecture (UML, Acceleo), OpenAPI</w:t>
+        <w:t>Architecture hexagonale, Cloud native, 12-factor app, Reactive, Microservices, CQRS, Event-driven, Domain-Driven Design, SOLID, Référentiels clients (MDM, golden record, vision 360), Model Driven Architecture (UML, Acceleo), OpenAPI</w:t>
       </w:r>
     </w:p>
     <w:p>
@@ -114,7 +114,7 @@
           <w:b w:val="0"/>
           <w:sz w:val="22"/>
         </w:rPr>
-        <w:t>Java, Quarkus, Spring Boot, Spring, Python, Flask, REST, JPA/Hibernate, Spring Data, QueryDSL, jOOQ, Panache, OAuth2 / JWT, SOAP (JAX-WS), Diagnostic JVM (profiling, GC, concurrence)</w:t>
+        <w:t>Java, Quarkus, Spring Boot, Spring, Python, Flask, REST, JPA/Hibernate, Spring Data, QueryDSL, jOOQ, Panache, SOAP (JAX-WS), Diagnostic JVM (profiling, GC, concurrence)</w:t>
       </w:r>
     </w:p>
     <w:p>
@@ -214,6 +214,42 @@
           <w:b/>
           <w:sz w:val="22"/>
         </w:rPr>
+        <w:t xml:space="preserve">Sécurité : </w:t>
+      </w:r>
+      <w:r>
+        <w:rPr>
+          <w:rFonts w:ascii="Calibri" w:hAnsi="Calibri"/>
+          <w:b w:val="0"/>
+          <w:sz w:val="22"/>
+        </w:rPr>
+        <w:t>OAuth2 / OIDC, JWT, Keycloak, Azure AD, OWASP, PKI / TLS</w:t>
+      </w:r>
+    </w:p>
+    <w:p>
+      <w:r>
+        <w:rPr>
+          <w:rFonts w:ascii="Calibri" w:hAnsi="Calibri"/>
+          <w:b/>
+          <w:sz w:val="22"/>
+        </w:rPr>
+        <w:t xml:space="preserve">IA générative : </w:t>
+      </w:r>
+      <w:r>
+        <w:rPr>
+          <w:rFonts w:ascii="Calibri" w:hAnsi="Calibri"/>
+          <w:b w:val="0"/>
+          <w:sz w:val="22"/>
+        </w:rPr>
+        <w:t>LLM, GitHub Copilot, JetBrains AI Assistant, GitLab Duo, ChatGPT</w:t>
+      </w:r>
+    </w:p>
+    <w:p>
+      <w:r>
+        <w:rPr>
+          <w:rFonts w:ascii="Calibri" w:hAnsi="Calibri"/>
+          <w:b/>
+          <w:sz w:val="22"/>
+        </w:rPr>
         <w:t xml:space="preserve">Monitoring &amp; Observabilité : </w:t>
       </w:r>
       <w:r>
@@ -258,7 +294,7 @@
           <w:b w:val="0"/>
           <w:sz w:val="22"/>
         </w:rPr>
-        <w:t>Agile (SCRUM), TDD, Code review</w:t>
+        <w:t>Agile (Scrum, SAFe), Jira / Confluence, TDD, Code review</w:t>
       </w:r>
     </w:p>
     <w:p>
@@ -269,6 +305,109 @@
           <w:sz w:val="24"/>
         </w:rPr>
         <w:t>Expérience professionnelle</w:t>
+      </w:r>
+    </w:p>
+    <w:p>
+      <w:r>
+        <w:rPr>
+          <w:rFonts w:ascii="Calibri" w:hAnsi="Calibri"/>
+          <w:b/>
+          <w:sz w:val="22"/>
+        </w:rPr>
+        <w:t>Architecte solution – Référentiel Client Unique (Freelance) — BNP Paribas Personal Finance (Cetelem)</w:t>
+      </w:r>
+    </w:p>
+    <w:p>
+      <w:r>
+        <w:rPr>
+          <w:rFonts w:ascii="Calibri" w:hAnsi="Calibri"/>
+          <w:b w:val="0"/>
+          <w:sz w:val="20"/>
+        </w:rPr>
+        <w:t>2024-10 – 2025-03 | Nantes</w:t>
+      </w:r>
+    </w:p>
+    <w:p>
+      <w:pPr>
+        <w:pStyle w:val="ListBullet"/>
+      </w:pPr>
+      <w:r>
+        <w:rPr>
+          <w:rFonts w:ascii="Calibri" w:hAnsi="Calibri"/>
+          <w:b w:val="0"/>
+          <w:sz w:val="22"/>
+        </w:rPr>
+        <w:t>Cadrage de la refonte des référentiels clients d'un grand acteur du crédit à la consommation en un Référentiel Client Unique (RCU) partagé par l'ensemble de la DSI, en lien avec les architectes et le centre d'excellence Architecture</w:t>
+      </w:r>
+    </w:p>
+    <w:p>
+      <w:pPr>
+        <w:pStyle w:val="ListBullet"/>
+      </w:pPr>
+      <w:r>
+        <w:rPr>
+          <w:rFonts w:ascii="Calibri" w:hAnsi="Calibri"/>
+          <w:b w:val="0"/>
+          <w:sz w:val="22"/>
+        </w:rPr>
+        <w:t>Analyse de l'existant (référentiels multiples, synchronisations différées) et des retours d'expérience d'autres entités du groupe</w:t>
+      </w:r>
+    </w:p>
+    <w:p>
+      <w:pPr>
+        <w:pStyle w:val="ListBullet"/>
+      </w:pPr>
+      <w:r>
+        <w:rPr>
+          <w:rFonts w:ascii="Calibri" w:hAnsi="Calibri"/>
+          <w:b w:val="0"/>
+          <w:sz w:val="22"/>
+        </w:rPr>
+        <w:t>Définition de la cible : golden record centré personne (identité unique, contrats, moyens de contact contextualisés), vision 360 alimentée en temps réel, gestion des comptes utilisateur et des consentements RGPD</w:t>
+      </w:r>
+    </w:p>
+    <w:p>
+      <w:pPr>
+        <w:pStyle w:val="ListBullet"/>
+      </w:pPr>
+      <w:r>
+        <w:rPr>
+          <w:rFonts w:ascii="Calibri" w:hAnsi="Calibri"/>
+          <w:b w:val="0"/>
+          <w:sz w:val="22"/>
+        </w:rPr>
+        <w:t>Architecture CQRS et hexagonale pilotée par les événements, alignée sur les standards techniques du groupe</w:t>
+      </w:r>
+    </w:p>
+    <w:p>
+      <w:pPr>
+        <w:pStyle w:val="ListBullet"/>
+      </w:pPr>
+      <w:r>
+        <w:rPr>
+          <w:rFonts w:ascii="Calibri" w:hAnsi="Calibri"/>
+          <w:b w:val="0"/>
+          <w:sz w:val="22"/>
+        </w:rPr>
+        <w:t>Trajectoire de migration progressive (double run, puis décommissionnement de l'existant), présentée en comité pour la décision d'investissement</w:t>
+      </w:r>
+    </w:p>
+    <w:p>
+      <w:r>
+        <w:rPr>
+          <w:rFonts w:ascii="Calibri" w:hAnsi="Calibri"/>
+          <w:b/>
+          <w:sz w:val="20"/>
+        </w:rPr>
+        <w:t xml:space="preserve">Stack : </w:t>
+      </w:r>
+      <w:r>
+        <w:rPr>
+          <w:rFonts w:ascii="Calibri" w:hAnsi="Calibri"/>
+          <w:b w:val="0"/>
+          <w:sz w:val="20"/>
+        </w:rPr>
+        <w:t>Java, Spring Boot, CQRS, Architecture hexagonale, Event-driven, API Management, RGPD</w:t>
       </w:r>
     </w:p>
     <w:p>
@@ -314,7 +453,20 @@
           <w:b w:val="0"/>
           <w:sz w:val="22"/>
         </w:rPr>
-        <w:t>Architecte de l'équipe Care/Marketing, responsable du référentiel clients omnicanal : centralisation des données, diffusion par API aux partenaires internes/externes, intégration Captain Wallet (carte de fidélité dématérialisée)</w:t>
+        <w:t>Architecte de l'équipe Care/Marketing, responsable du Référentiel Client Unique omnicanal : centralisation des données, exposition par API et diffusion des modifications aux partenaires internes (Microsoft Dynamics, Magento, caisses) et externes (Selligent, Captain Wallet)</w:t>
+      </w:r>
+    </w:p>
+    <w:p>
+      <w:pPr>
+        <w:pStyle w:val="ListBullet"/>
+      </w:pPr>
+      <w:r>
+        <w:rPr>
+          <w:rFonts w:ascii="Calibri" w:hAnsi="Calibri"/>
+          <w:b w:val="0"/>
+          <w:sz w:val="22"/>
+        </w:rPr>
+        <w:t>Étude des Customer Data Platforms (CDP) pour en reprendre les bonnes pratiques (dédoublonnage, resynchronisation)</w:t>
       </w:r>
     </w:p>
     <w:p>

</xml_diff>

<commit_message>
data: projets open source et développement assisté par IA
- Projets : stack Pedalons corrigée (React, Flutter, Karoo/Garmin, OpenAPI),
  ajout de vcyclist et des bibliothèques open source (nmt-metrics, SDK FIT,
  leaflet-relief/elevation) avec leurs publications Maven Central/npm
- Compétences : catégorie « Développement assisté par IA » (Claude Code,
  développement agentique, extension d'agents, garde-fous qualité)
- Résumé : mention du développement agentique, « Architecte logiciel »

Co-Authored-By: Claude Opus 5 (1M context) <noreply@anthropic.com>
Claude-Session: https://claude.ai/code/session_014zxa54z3sHfBvd7U11WXxp
</commit_message>
<xml_diff>
--- a/docs/downloads/Gabriel_Landais_CV_FR.docx
+++ b/docs/downloads/Gabriel_Landais_CV_FR.docx
@@ -58,7 +58,7 @@
           <w:b w:val="0"/>
           <w:sz w:val="22"/>
         </w:rPr>
-        <w:t>Architecte logiciels freelance, diplômé de l'IMT Atlantique (2003),</w:t>
+        <w:t>Architecte logiciel freelance, diplômé de l'IMT Atlantique (2003),</w:t>
         <w:br/>
         <w:t>avec plus de 20 ans d'expérience dans la conception et le développement de solutions</w:t>
         <w:br/>
@@ -68,7 +68,9 @@
         <w:br/>
         <w:t>de fortes capacités d'analyse et un goût prononcé pour les environnements distribués</w:t>
         <w:br/>
-        <w:t>et cloud-native.</w:t>
+        <w:t>et cloud-native. Pratique avancée du développement agentique (Claude Code) pour</w:t>
+        <w:br/>
+        <w:t>accélérer la conception, le prototypage et la livraison.</w:t>
       </w:r>
     </w:p>
     <w:p>
@@ -232,7 +234,7 @@
           <w:b/>
           <w:sz w:val="22"/>
         </w:rPr>
-        <w:t xml:space="preserve">IA générative : </w:t>
+        <w:t xml:space="preserve">Développement assisté par IA : </w:t>
       </w:r>
       <w:r>
         <w:rPr>
@@ -240,7 +242,7 @@
           <w:b w:val="0"/>
           <w:sz w:val="22"/>
         </w:rPr>
-        <w:t>LLM, GitHub Copilot, JetBrains AI Assistant, GitLab Duo, ChatGPT</w:t>
+        <w:t>Claude Code (usage quotidien), Développement agentique piloté par spécification, Sous-agents et workflows multi-agents, Extension d'agents : skills, hooks, commandes, plugins, Garde-fous qualité (tests, revue, CLAUDE.md), LLM, GitHub Copilot</w:t>
       </w:r>
     </w:p>
     <w:p>
@@ -1322,7 +1324,7 @@
           <w:b w:val="0"/>
           <w:sz w:val="22"/>
         </w:rPr>
-        <w:t>Plateforme SaaS multi-tenant pour clubs cyclistes : gestion d'inscriptions, résultats, planning, sorties et partage de routes GPX</w:t>
+        <w:t>Plateforme SaaS multi-tenant pour clubs cyclistes (sorties, séjours, routes GPX sur cartes interactives, communication) : backend Quarkus, SPA React, application mobile Flutter, extensions pour compteurs GPS Karoo et Garmin, API conçue par contrat OpenAPI. Conçue et développée en solo avec Claude Code (850+ commits en 9 mois) ; prolonge une contribution à la plateforme open source biketeam</w:t>
       </w:r>
     </w:p>
     <w:p>
@@ -1332,7 +1334,7 @@
           <w:b w:val="0"/>
           <w:sz w:val="20"/>
         </w:rPr>
-        <w:t>Quarkus, Vue 3, PostgreSQL, Keycloak, Multi-tenant, MapLibre, GPX, PMTiles</w:t>
+        <w:t>Java 21, Quarkus, PostgreSQL, PostGIS, React, TypeScript, Flutter, Kotlin, OpenAPI, Multi-tenant, Claude Code</w:t>
       </w:r>
     </w:p>
     <w:p>
@@ -1352,7 +1354,7 @@
           <w:b w:val="0"/>
           <w:sz w:val="22"/>
         </w:rPr>
-        <w:t>Analyse de tracés GPS et validation électronique pour épreuves de grande randonnée cycliste et ultra-cyclisme (brevets ACP)</w:t>
+        <w:t>Analyse de tracés GPS et validation électronique pour épreuves de grande randonnée cycliste et ultra-cyclisme (brevets ACP), en production depuis 2016</w:t>
       </w:r>
     </w:p>
     <w:p>
@@ -1363,6 +1365,66 @@
           <w:sz w:val="20"/>
         </w:rPr>
         <w:t>Python, numpy, Flask, MongoDB, Kafka, Docker, GPS</w:t>
+      </w:r>
+    </w:p>
+    <w:p>
+      <w:r>
+        <w:rPr>
+          <w:rFonts w:ascii="Calibri" w:hAnsi="Calibri"/>
+          <w:b/>
+          <w:sz w:val="22"/>
+        </w:rPr>
+        <w:t>vcyclist (https://github.com/glandais/vcyclist)</w:t>
+      </w:r>
+    </w:p>
+    <w:p>
+      <w:r>
+        <w:rPr>
+          <w:rFonts w:ascii="Calibri" w:hAnsi="Calibri"/>
+          <w:b w:val="0"/>
+          <w:sz w:val="22"/>
+        </w:rPr>
+        <w:t>Moteur open source de simulation cycliste fondé sur la physique (puissance, W′bal, vitesse en virage et au freinage, correction d'altitude), porté de Java vers Kotlin Multiplatform (JVM, JS, Wasm) ; publié sur Maven Central et npm (~900 téléchargements/mois)</w:t>
+      </w:r>
+    </w:p>
+    <w:p>
+      <w:r>
+        <w:rPr>
+          <w:rFonts w:ascii="Calibri" w:hAnsi="Calibri"/>
+          <w:b w:val="0"/>
+          <w:sz w:val="20"/>
+        </w:rPr>
+        <w:t>Kotlin Multiplatform, Java, TypeScript, WebAssembly, GPX, Maven Central, npm</w:t>
+      </w:r>
+    </w:p>
+    <w:p>
+      <w:r>
+        <w:rPr>
+          <w:rFonts w:ascii="Calibri" w:hAnsi="Calibri"/>
+          <w:b/>
+          <w:sz w:val="22"/>
+        </w:rPr>
+        <w:t>Bibliothèques open source (https://github.com/glandais)</w:t>
+      </w:r>
+    </w:p>
+    <w:p>
+      <w:r>
+        <w:rPr>
+          <w:rFonts w:ascii="Calibri" w:hAnsi="Calibri"/>
+          <w:b w:val="0"/>
+          <w:sz w:val="22"/>
+        </w:rPr>
+        <w:t>nmt-metrics : suivi de la mémoire native JVM en conteneur via Micrometer/Prometheus (Maven Central) ; SDK non officiels du format FIT de Garmin pour Kotlin Multiplatform et Dart, générés par rétro-ingénierie du générateur officiel (Maven Central, npm) ; leaflet-relief et elevation : relief, pentes et altimétrie cartographiques (~1 100 téléchargements npm/mois)</w:t>
+      </w:r>
+    </w:p>
+    <w:p>
+      <w:r>
+        <w:rPr>
+          <w:rFonts w:ascii="Calibri" w:hAnsi="Calibri"/>
+          <w:b w:val="0"/>
+          <w:sz w:val="20"/>
+        </w:rPr>
+        <w:t>Java, Micrometer, Prometheus, Kotlin Multiplatform, Dart, TypeScript, Leaflet, Génération de code</w:t>
       </w:r>
     </w:p>
     <w:p>

</xml_diff>

<commit_message>
data: ajoute la mission Nickel (depuis 2025-02)
- Authentification forte, SCA, DSP2 et cryptographie sur HSM (Wero,
  terminaux de paiement, PCI-DSS), performance JVM sous Kubernetes,
  socle Spring Boot 4, POC OAuth 2.1 / OIDC, Claude Code et MCP
- Formulation générique : sans noms de services internes ni détails
  de sécurité ; l'inventaire détaillé reste hors du dépôt
- Cetelem recalé sur 2024-09 → 2025-02 pour éviter le chevauchement

Co-Authored-By: Claude Opus 5 (1M context) <noreply@anthropic.com>
Claude-Session: https://claude.ai/code/session_014zxa54z3sHfBvd7U11WXxp
</commit_message>
<xml_diff>
--- a/docs/downloads/Gabriel_Landais_CV_FR.docx
+++ b/docs/downloads/Gabriel_Landais_CV_FR.docx
@@ -316,6 +316,122 @@
           <w:b/>
           <w:sz w:val="22"/>
         </w:rPr>
+        <w:t>Architecte / Développeur expert Java – Authentification forte et cryptographie (Freelance) — Nickel (BNP Paribas)</w:t>
+      </w:r>
+    </w:p>
+    <w:p>
+      <w:r>
+        <w:rPr>
+          <w:rFonts w:ascii="Calibri" w:hAnsi="Calibri"/>
+          <w:b w:val="0"/>
+          <w:sz w:val="20"/>
+        </w:rPr>
+        <w:t>2025-02 – Présent</w:t>
+      </w:r>
+    </w:p>
+    <w:p>
+      <w:pPr>
+        <w:pStyle w:val="ListBullet"/>
+      </w:pPr>
+      <w:r>
+        <w:rPr>
+          <w:rFonts w:ascii="Calibri" w:hAnsi="Calibri"/>
+          <w:b w:val="0"/>
+          <w:sz w:val="22"/>
+        </w:rPr>
+        <w:t>Squad authentification forte, SCA, DSP2 et cryptographie d'une néobanque de plusieurs millions de clients : conception, développement et mise en production de microservices Java critiques</w:t>
+      </w:r>
+    </w:p>
+    <w:p>
+      <w:pPr>
+        <w:pStyle w:val="ListBullet"/>
+      </w:pPr>
+      <w:r>
+        <w:rPr>
+          <w:rFonts w:ascii="Calibri" w:hAnsi="Calibri"/>
+          <w:b w:val="0"/>
+          <w:sz w:val="22"/>
+        </w:rPr>
+        <w:t>Conception et développement d'un service de cryptographie centralisé sur HSM (signature JWS, chiffrement AES-GCM, rotation de clés) pour les paiements instantanés européens (Wero) et les terminaux de paiement, en périmètre PCI-DSS ; responsable de la première mise en production ; implémentation d'AES-DUKPT (ANSI X9.24-3) validée avec l'éditeur du HSM</w:t>
+      </w:r>
+    </w:p>
+    <w:p>
+      <w:pPr>
+        <w:pStyle w:val="ListBullet"/>
+      </w:pPr>
+      <w:r>
+        <w:rPr>
+          <w:rFonts w:ascii="Calibri" w:hAnsi="Calibri"/>
+          <w:b w:val="0"/>
+          <w:sz w:val="22"/>
+        </w:rPr>
+        <w:t>Performance : débit du service de cryptographie multiplié par 32 à 41 (p95 de 0,8 s à 27 ms) ; campagnes Gatling jusqu'à 17 800 req/s ; diagnostic d'OOMKill et harmonisation du dimensionnement JVM sous Kubernetes, CPU par requête réduit de 38 à 50 %</w:t>
+      </w:r>
+    </w:p>
+    <w:p>
+      <w:pPr>
+        <w:pStyle w:val="ListBullet"/>
+      </w:pPr>
+      <w:r>
+        <w:rPr>
+          <w:rFonts w:ascii="Calibri" w:hAnsi="Calibri"/>
+          <w:b w:val="0"/>
+          <w:sz w:val="22"/>
+        </w:rPr>
+        <w:t>Authentification forte : validation sur appareil de confiance remplaçant l'OTP SMS (enrôlement, webhooks, circuit breaker partagé entre pods), parcours de consentement Open Banking DSP2 de bout en bout (API, BFF, React), migrations SQL Server sans interruption sur des tables de plusieurs dizaines de millions de lignes</w:t>
+      </w:r>
+    </w:p>
+    <w:p>
+      <w:pPr>
+        <w:pStyle w:val="ListBullet"/>
+      </w:pPr>
+      <w:r>
+        <w:rPr>
+          <w:rFonts w:ascii="Calibri" w:hAnsi="Calibri"/>
+          <w:b w:val="0"/>
+          <w:sz w:val="22"/>
+        </w:rPr>
+        <w:t>Socle et gouvernance : migration Spring Boot 4 de la bibliothèque socle, Problem Details (RFC 9457), règles ArchUnit de contrat d'API, null-safety NullAway ; POC de serveur d'autorisation OAuth 2.1 / OIDC (PKCE, PAR, DPoP), ADR et formation des développeurs</w:t>
+      </w:r>
+    </w:p>
+    <w:p>
+      <w:pPr>
+        <w:pStyle w:val="ListBullet"/>
+      </w:pPr>
+      <w:r>
+        <w:rPr>
+          <w:rFonts w:ascii="Calibri" w:hAnsi="Calibri"/>
+          <w:b w:val="0"/>
+          <w:sz w:val="22"/>
+        </w:rPr>
+        <w:t>Développement agentique au quotidien avec Claude Code, connecté aux outils de l'équipe par MCP (JIRA, GitLab, Kubernetes, Prometheus) avec orchestration multi-agents ; relecture automatique des merge requests par IA intégrée à la CI</w:t>
+      </w:r>
+    </w:p>
+    <w:p>
+      <w:r>
+        <w:rPr>
+          <w:rFonts w:ascii="Calibri" w:hAnsi="Calibri"/>
+          <w:b/>
+          <w:sz w:val="20"/>
+        </w:rPr>
+        <w:t xml:space="preserve">Stack : </w:t>
+      </w:r>
+      <w:r>
+        <w:rPr>
+          <w:rFonts w:ascii="Calibri" w:hAnsi="Calibri"/>
+          <w:b w:val="0"/>
+          <w:sz w:val="20"/>
+        </w:rPr>
+        <w:t>Java 21/25, Spring Boot 3/4, Spring Security, Kafka, SQL Server, HSM (PKCS#11), React, Kubernetes, Helm, ArgoCD, GitLab CI, Prometheus, Grafana, Gatling</w:t>
+      </w:r>
+    </w:p>
+    <w:p>
+      <w:r>
+        <w:rPr>
+          <w:rFonts w:ascii="Calibri" w:hAnsi="Calibri"/>
+          <w:b/>
+          <w:sz w:val="22"/>
+        </w:rPr>
         <w:t>Architecte solution – Référentiel Client Unique (Freelance) — BNP Paribas Personal Finance (Cetelem)</w:t>
       </w:r>
     </w:p>
@@ -326,7 +442,7 @@
           <w:b w:val="0"/>
           <w:sz w:val="20"/>
         </w:rPr>
-        <w:t>2024-10 – 2025-03 | Nantes</w:t>
+        <w:t>2024-09 – 2025-02 | Nantes</w:t>
       </w:r>
     </w:p>
     <w:p>

</xml_diff>

<commit_message>
fix: corrections du second audit ATS, fiche Nickel caviardée
- Nickel : détails sensibles retirés (algorithmes, protocoles, chiffres
  exacts), outil LLM agentique sans nommer le produit, intitulé raccourci
- Compétences : API REST, cloud native, Outbox/Saga, Resilience4j, TOGAF,
  Kafka Streams/Avro, tests (JUnit 5, Testcontainers), CDC, AWS, GitOps,
  OpenTelemetry, SRE, Keycloak, LLM/RAG, Copilot, Cursor, clean code
- Espaces insécables appliqués au chargement du YAML
- PDF : stack gardée avec ses puces, contact non coupé, années compactes
- DOCX : description, app.xml et vignette du modèle nettoyés, mots-clés
  non tronqués ; site : meta description/auteur, liens projets lisibles
- PCI DSS, intitulés sans double tiret, lien PR Quarkus #16766

Co-Authored-By: Claude Opus 5 (1M context) <noreply@anthropic.com>
Claude-Session: https://claude.ai/code/session_014zxa54z3sHfBvd7U11WXxp
</commit_message>
<xml_diff>
--- a/docs/downloads/Gabriel_Landais_CV_FR.docx
+++ b/docs/downloads/Gabriel_Landais_CV_FR.docx
@@ -171,7 +171,7 @@
           <w:b w:val="0"/>
           <w:sz w:val="21"/>
         </w:rPr>
-        <w:t>Microservices, Event-driven, CQRS, Architecture hexagonale, DDD, API-first (OpenAPI), ADR, Référentiels clients (MDM, golden record, vision 360°)</w:t>
+        <w:t>Microservices, Cloud native, Event-driven, CQRS, Architecture hexagonale, DDD, API REST, API-first (OpenAPI), Outbox, Saga, Résilience (Resilience4j), ADR, dossier d'architecture, TOGAF, Référentiels clients (MDM, golden record, rapprochement, qualité de données, vision 360°)</w:t>
       </w:r>
     </w:p>
     <w:p>
@@ -189,7 +189,7 @@
           <w:b w:val="0"/>
           <w:sz w:val="21"/>
         </w:rPr>
-        <w:t>Java 21/25, Spring Boot 3/4, Spring Security, Quarkus 3, JPA/Hibernate, Kafka, Performance JVM (profiling, GC, mémoire native), Python</w:t>
+        <w:t>Java 21/25, Spring Boot 3/4, Spring Security, Quarkus 3, JPA/Hibernate, Kafka (Streams, Schema Registry, Avro), JUnit 5, Mockito, Testcontainers, Performance JVM (profiling, GC, mémoire native), Python</w:t>
       </w:r>
     </w:p>
     <w:p>
@@ -207,7 +207,7 @@
           <w:b w:val="0"/>
           <w:sz w:val="21"/>
         </w:rPr>
-        <w:t>PostgreSQL/PostGIS, SQL Server, Oracle, MongoDB, Cassandra, Elasticsearch, Liquibase</w:t>
+        <w:t>PostgreSQL/PostGIS, SQL Server, Oracle, MongoDB, Cassandra, Elasticsearch, Liquibase, CDC/Debezium</w:t>
       </w:r>
     </w:p>
     <w:p>
@@ -225,7 +225,7 @@
           <w:b w:val="0"/>
           <w:sz w:val="21"/>
         </w:rPr>
-        <w:t>Kubernetes, Helm, Docker, Google Cloud (GCP, GKE), Azure, Terraform, CI/CD (GitLab CI, GitHub Actions, Jenkins), ArgoCD, Prometheus/Grafana, Gatling, k6</w:t>
+        <w:t>Kubernetes, Helm, Docker, Google Cloud (GCP, GKE), Azure, AWS, Terraform, CI/CD (GitLab CI, GitHub Actions, Jenkins), GitOps (ArgoCD), OpenTelemetry, Prometheus/Grafana, SRE, Gatling, k6</w:t>
       </w:r>
     </w:p>
     <w:p>
@@ -243,7 +243,7 @@
           <w:b w:val="0"/>
           <w:sz w:val="21"/>
         </w:rPr>
-        <w:t>OAuth2 / OIDC, JWT/JWS, Authentification forte (SCA, DSP2), Cryptographie et HSM (PKCS#11), PCI-DSS, OWASP</w:t>
+        <w:t>OAuth2 / OIDC, Keycloak, JWT/JWS, SCA/DSP2, Cryptographie et HSM, PCI DSS, OWASP</w:t>
       </w:r>
     </w:p>
     <w:p>
@@ -253,7 +253,7 @@
           <w:b/>
           <w:sz w:val="21"/>
         </w:rPr>
-        <w:t xml:space="preserve">Développement assisté par IA : </w:t>
+        <w:t xml:space="preserve">IA générative et développement agentique : </w:t>
       </w:r>
       <w:r>
         <w:rPr>
@@ -261,7 +261,7 @@
           <w:b w:val="0"/>
           <w:sz w:val="21"/>
         </w:rPr>
-        <w:t>Claude Code (usage quotidien), Développement agentique piloté par spécification, MCP, Orchestration multi-agents, Extension d'agents (skills, hooks, plugins), Revue de code par IA en CI</w:t>
+        <w:t>LLM, Intégration de LLM et RAG, Claude Code, GitHub Copilot, Cursor, Développement piloté par spécification, MCP, Orchestration multi-agents, Skills, hooks et plugins d'agents, Revue de code par IA en CI</w:t>
       </w:r>
     </w:p>
     <w:p>
@@ -297,7 +297,7 @@
           <w:b w:val="0"/>
           <w:sz w:val="21"/>
         </w:rPr>
-        <w:t>Agile (Scrum, SAFe), TDD, Revue de code, Tests de performance, Banque et paiement, Crédit à la consommation, Retail omnicanal, SaaS B2B</w:t>
+        <w:t>Agile (Scrum, SAFe), TDD, Clean code, SOLID, Revue de code, Encadrement et mentorat, Tests de performance, Banque et paiement, Crédit à la consommation, Retail omnicanal, SaaS B2B</w:t>
       </w:r>
     </w:p>
     <w:p>
@@ -325,7 +325,7 @@
           <w:b/>
           <w:sz w:val="21"/>
         </w:rPr>
-        <w:t>Architecte / Développeur expert Java – Authentification forte et cryptographie — Nickel (BNP Paribas)</w:t>
+        <w:t>Développeur expert Java / Architecte — Nickel (BNP Paribas)</w:t>
       </w:r>
     </w:p>
     <w:p>
@@ -366,7 +366,7 @@
           <w:b w:val="0"/>
           <w:sz w:val="21"/>
         </w:rPr>
-        <w:t>Création d'un service de cryptographie centralisé sur HSM (JWS, AES-GCM, rotation de clés, AES-DUKPT) pour les paiements instantanés européens (Wero) et les terminaux de paiement, en périmètre PCI-DSS ; responsable de la première mise en production</w:t>
+        <w:t>Création d'un service de cryptographie centralisé sur HSM pour les paiements instantanés et la monétique, en périmètre PCI DSS ; responsable de la première mise en production</w:t>
       </w:r>
     </w:p>
     <w:p>
@@ -380,7 +380,7 @@
           <w:b w:val="0"/>
           <w:sz w:val="21"/>
         </w:rPr>
-        <w:t>Performance : débit du service de cryptographie multiplié par 32 à 41 (p95 de 0,8 s à 27 ms), tirs Gatling jusqu'à 17 800 req/s, dimensionnement JVM sous Kubernetes harmonisé, CPU par requête réduit de 38 à 50 %</w:t>
+        <w:t>Performance : débit du service de cryptographie multiplié par plus de 30 et latence p95 divisée par 30, campagnes de tests de charge (Gatling, k6), dimensionnement JVM sous Kubernetes harmonisé, CPU par requête réduit de près de moitié</w:t>
       </w:r>
     </w:p>
     <w:p>
@@ -394,7 +394,7 @@
           <w:b w:val="0"/>
           <w:sz w:val="21"/>
         </w:rPr>
-        <w:t>Authentification forte : validation sur appareil de confiance remplaçant l'OTP SMS, parcours de consentement Open Banking DSP2 de bout en bout (API, BFF, React), migrations SQL Server sans interruption sur des dizaines de millions de lignes</w:t>
+        <w:t>Authentification forte : nouveau facteur sur appareil de confiance, parcours de consentement Open Banking DSP2 de bout en bout (API REST, BFF, React), migrations de données sans interruption sur de gros volumes</w:t>
       </w:r>
     </w:p>
     <w:p>
@@ -408,7 +408,7 @@
           <w:b w:val="0"/>
           <w:sz w:val="21"/>
         </w:rPr>
-        <w:t>Socle et gouvernance : migration Spring Boot 4 de la bibliothèque socle, règles ArchUnit de contrat d'API, null-safety NullAway ; POC de serveur d'autorisation OAuth2.1 / OIDC (PKCE, PAR, DPoP), ADR et formation des développeurs</w:t>
+        <w:t>Socle et gouvernance : migration Spring Boot 4 de la bibliothèque socle, règles ArchUnit de contrat d'API, null-safety NullAway, résilience (Resilience4j) ; POC de serveur d'autorisation OAuth2.1 / OIDC (PKCE, PAR, DPoP), ADR et formation des développeurs</w:t>
       </w:r>
     </w:p>
     <w:p>
@@ -422,7 +422,7 @@
           <w:b w:val="0"/>
           <w:sz w:val="21"/>
         </w:rPr>
-        <w:t>Développement agentique au quotidien avec Claude Code connecté aux outils de l'équipe par MCP (JIRA, GitLab, Kubernetes, Prometheus) ; relecture des merge requests par IA intégrée à la CI</w:t>
+        <w:t>Développement au quotidien avec un outil LLM agentique intégré aux outils de l'équipe ; relecture des merge requests par IA intégrée à la CI</w:t>
       </w:r>
     </w:p>
     <w:p>
@@ -443,7 +443,7 @@
           <w:b w:val="0"/>
           <w:sz w:val="20"/>
         </w:rPr>
-        <w:t>Java 21/25, Spring Boot 3/4, Spring Security, Kafka, SQL Server, HSM (PKCS#11), React, Kubernetes, ArgoCD, GitLab CI, Prometheus/Grafana, Gatling, k6</w:t>
+        <w:t>Java 21/25, Spring Boot 3/4, Spring Security, Kafka, SQL Server, HSM, React, Kubernetes, ArgoCD, GitLab CI, Prometheus/Grafana, Gatling, k6</w:t>
       </w:r>
     </w:p>
     <w:p>
@@ -457,7 +457,7 @@
           <w:b/>
           <w:sz w:val="21"/>
         </w:rPr>
-        <w:t>Architecte solution – Référentiel Client Unique — BNP Paribas Personal Finance (Cetelem)</w:t>
+        <w:t>Architecte solution Référentiel Client Unique — BNP Paribas Personal Finance (Cetelem)</w:t>
       </w:r>
     </w:p>
     <w:p>
@@ -886,7 +886,7 @@
           <w:b w:val="0"/>
           <w:sz w:val="21"/>
         </w:rPr>
-        <w:t>Backlog technique priorisé (sprints de 2 semaines), outillage de configuration pour les linguistes et le product manager, reporting au CTO</w:t>
+        <w:t>Backlog technique priorisé (sprints de 2 semaines), outillage de configuration pour les linguistes et le product manager, reporting au CTO</w:t>
       </w:r>
     </w:p>
     <w:p>
@@ -948,7 +948,7 @@
           <w:b w:val="0"/>
           <w:sz w:val="21"/>
         </w:rPr>
-        <w:t>Responsable technique d'un SIG de grande envergure jusqu'à 12 développeurs (socle, revues de code, qualité Sonar) : ORM géographique sur QueryDSL, mode hors ligne GeoPackage synchronisé avec Oracle ; remplacement de briques ESRI propriétaires, rendant le projet éligible au CIR</w:t>
+        <w:t>Responsable technique d'un SIG de grande envergure jusqu'à 12 développeurs (socle, revues de code, qualité Sonar) : ORM géographique sur QueryDSL, mode hors ligne GeoPackage synchronisé avec Oracle ; remplacement de briques ESRI propriétaires, rendant le projet éligible au CIR</w:t>
       </w:r>
     </w:p>
     <w:p>
@@ -962,7 +962,7 @@
           <w:b w:val="0"/>
           <w:sz w:val="21"/>
         </w:rPr>
-        <w:t>Architecture microservices sur GCP (App Engine, Datastore, Dataflow) pour LivingPackets, contrats OpenAPI générant les clients mobiles, accompagnement de 5 développeurs</w:t>
+        <w:t>Architecture microservices sur GCP (App Engine, Datastore, Dataflow) pour LivingPackets, contrats OpenAPI générant les clients mobiles, accompagnement de 5 développeurs</w:t>
       </w:r>
     </w:p>
     <w:p>
@@ -976,7 +976,7 @@
           <w:b w:val="0"/>
           <w:sz w:val="21"/>
         </w:rPr>
-        <w:t>Forfaits livrés sous contrainte : plugin QGIS/PyQt pour SNCF Réseau (cadre posé en 2 semaines, application réécrite en 2 mois à 3) ; migration Exalead vers Solr pour le BRGM avec une marge supérieure de 30 k€ à l'objectif (~100 j/h)</w:t>
+        <w:t>Forfaits livrés sous contrainte : plugin QGIS/PyQt pour SNCF Réseau (cadre posé en 2 semaines, application réécrite en 2 mois à 3) ; migration Exalead vers Solr pour le BRGM avec une marge supérieure de 30 k€ à l'objectif (~100 j/h)</w:t>
       </w:r>
     </w:p>
     <w:p>
@@ -1073,7 +1073,7 @@
           <w:b/>
           <w:sz w:val="21"/>
         </w:rPr>
-        <w:t xml:space="preserve">2004 – 2010 — Capgemini, Code Lutin, BlueXML, Sneda, Mediasofts, Développeur, R&amp;D : </w:t>
+        <w:t xml:space="preserve">2004 – 2010 — Développeur et R&amp;D : </w:t>
       </w:r>
       <w:r>
         <w:rPr>
@@ -1081,7 +1081,7 @@
           <w:b w:val="0"/>
           <w:sz w:val="21"/>
         </w:rPr>
-        <w:t>Applications JEE, génération de code MDA (UML, Acceleo), SIG pour la Ville de Paris, outillage Eclipse RCP/OSGi, CAO 3D (Delphi, OpenGL)</w:t>
+        <w:t>Capgemini, Code Lutin, BlueXML, Sneda, Mediasofts : applications JEE, génération de code MDA (UML, Acceleo), SIG pour la Ville de Paris, outillage Eclipse RCP/OSGi, CAO 3D (Delphi, OpenGL)</w:t>
       </w:r>
     </w:p>
     <w:p>
@@ -1277,7 +1277,7 @@
           <w:b w:val="0"/>
           <w:sz w:val="21"/>
         </w:rPr>
-        <w:t>Contributeur Quarkus : correctif de l'extension kafka-client pour la compilation native GraalVM (1.11.7). Bibliothèques publiées sur Maven Central et npm (~2 000 téléchargements npm/mois) : vcyclist, moteur de simulation cycliste en Kotlin Multiplatform ; nmt-metrics, suivi de la mémoire native JVM en conteneur ; SDK du format FIT de Garmin générés par rétro-ingénierie ; leaflet-relief et elevation (cartographie)</w:t>
+        <w:t>Contributeur Quarkus (PR #16766, version 1.11.7) : correctif de l'extension kafka-client pour la compilation native GraalVM. Bibliothèques publiées sur Maven Central et npm (~2 000 téléchargements npm/mois) : vcyclist, moteur de simulation cycliste en Kotlin Multiplatform ; nmt-metrics, suivi de la mémoire native JVM en conteneur ; SDK du format FIT de Garmin générés par rétro-ingénierie ; leaflet-relief et elevation (cartographie)</w:t>
       </w:r>
     </w:p>
     <w:p>
@@ -1322,7 +1322,7 @@
           <w:b w:val="0"/>
           <w:sz w:val="21"/>
         </w:rPr>
-        <w:t xml:space="preserve"> — ENSG-Géomatique / Université de Marne-la-Vallée (2003 – 2004)</w:t>
+        <w:t xml:space="preserve"> — ENSG-Géomatique / Université de Marne-la-Vallée (2003–2004)</w:t>
       </w:r>
     </w:p>
     <w:p>
@@ -1340,7 +1340,7 @@
           <w:b w:val="0"/>
           <w:sz w:val="21"/>
         </w:rPr>
-        <w:t xml:space="preserve"> — IMT Atlantique (École des Mines de Nantes) (1999 – 2003)</w:t>
+        <w:t xml:space="preserve"> — IMT Atlantique (École des Mines de Nantes) (1999–2003)</w:t>
       </w:r>
     </w:p>
     <w:p>

</xml_diff>

<commit_message>
data: Nickel à Nantes, contribution Quarkus intégrée à la 2.0
Co-Authored-By: Claude Opus 5 (1M context) <noreply@anthropic.com>
Claude-Session: https://claude.ai/code/session_014zxa54z3sHfBvd7U11WXxp
</commit_message>
<xml_diff>
--- a/docs/downloads/Gabriel_Landais_CV_FR.docx
+++ b/docs/downloads/Gabriel_Landais_CV_FR.docx
@@ -338,7 +338,7 @@
           <w:b w:val="0"/>
           <w:sz w:val="20"/>
         </w:rPr>
-        <w:t>2025-02 – Présent | Freelance</w:t>
+        <w:t>2025-02 – Présent | Nantes | Freelance</w:t>
       </w:r>
     </w:p>
     <w:p>
@@ -1277,7 +1277,7 @@
           <w:b w:val="0"/>
           <w:sz w:val="21"/>
         </w:rPr>
-        <w:t>Contributeur Quarkus (PR #16766, version 1.11.7) : correctif de l'extension kafka-client pour la compilation native GraalVM. Bibliothèques publiées sur Maven Central et npm (~2 000 téléchargements npm/mois) : vcyclist, moteur de simulation cycliste en Kotlin Multiplatform ; nmt-metrics, suivi de la mémoire native JVM en conteneur ; SDK du format FIT de Garmin générés par rétro-ingénierie ; leaflet-relief et elevation (cartographie)</w:t>
+        <w:t>Contributeur Quarkus : correctif de l'extension kafka-client pour la compilation native GraalVM, intégré à Quarkus 2.0 (PR #16766). Bibliothèques publiées sur Maven Central et npm (~2 000 téléchargements npm/mois) : vcyclist, moteur de simulation cycliste en Kotlin Multiplatform ; nmt-metrics, suivi de la mémoire native JVM en conteneur ; SDK du format FIT de Garmin générés par rétro-ingénierie ; leaflet-relief et elevation (cartographie)</w:t>
       </w:r>
     </w:p>
     <w:p>

</xml_diff>